<commit_message>
Week 1: midterm/exam questions are Vietnamese-first with Chinese alongside (syllabus, slides zh/vi, script, chapter handout rebuilt from src)
Rebuilding from src also brings slide 33's wording fix (主管機關收緊).

Co-Authored-By: Claude Opus 5.5 <noreply@anthropic.com>
</commit_message>
<xml_diff>
--- a/第一週(09-10)/自動駕駛原理_第一章_課程講義.docx
+++ b/第一週(09-10)/自動駕駛原理_第一章_課程講義.docx
@@ -3125,7 +3125,7 @@
                 <w:sz w:val="19"/>
                 <w:szCs w:val="19"/>
               </w:rPr>
-              <w:t xml:space="preserve">概念題與圖表判讀，題目中英對照</w:t>
+              <w:t xml:space="preserve">概念題與圖表判讀，題目越南文為主、中文對照</w:t>
             </w:r>
           </w:p>
         </w:tc>
@@ -3324,7 +3324,7 @@
           <w:sz w:val="22"/>
           <w:szCs w:val="22"/>
         </w:rPr>
-        <w:t xml:space="preserve">實作佔的比重最高，考試比較輕，這是我刻意的安排。考試要讀題目、要寫字，那裡面有一半考的其實是語言能力。但是把模擬器跑起來、把場景分析出來，這些事情不需要通過語言這一關，比較能反映各位是不是真的懂了。考試的題目我會中英對照，選項盡量用圖片呈現。</w:t>
+        <w:t xml:space="preserve">實作佔的比重最高，考試比較輕，這是我刻意的安排。考試要讀題目、要寫字，那裡面有一半考的其實是語言能力。但是把模擬器跑起來、把場景分析出來，這些事情不需要通過語言這一關，比較能反映各位是不是真的懂了。考試的題目以越南文為主、附中文對照，選項盡量用圖片呈現。</w:t>
       </w:r>
     </w:p>
     <w:p>

</xml_diff>